<commit_message>
Align component lists: add missing parts to Spec and Guide BOMs
Design Spec was missing T1/T2 (MMBT3904), R17-R21 (10k x5),
R22-R23 (5.1k x2), R24 (1k). Design Guide placement table was
missing C1, C2, C3-C6, R1-R8, R9-R16, D1-D8, D9.
Both documents now share the same 29-component master BOM.
</commit_message>
<xml_diff>
--- a/SprinKlr8_Design_Spec.docx
+++ b/SprinKlr8_Design_Spec.docx
@@ -396,7 +396,7 @@
               <w:rPr>
                 <w:sz w:val="18"/>
               </w:rPr>
-              <w:t>~$7.85 fully assembled at 1,000 units  (BOM + PCB + assembly)</w:t>
+              <w:t>~$8.10 fully assembled at 1,000 units  (BOM + PCB + assembly)</w:t>
             </w:r>
           </w:p>
         </w:tc>
@@ -456,7 +456,7 @@
     </w:p>
     <w:p>
       <w:r>
-        <w:t>This document specifies the design and production plan for SprinKlr-8: a compact, low-cost ESP32-based irrigation controller with 8 independently switched zones. The board is optimized for volume production at JLCPCB using all-SMD components sourced through LCSC. v1.1 revises the power architecture (24VAC field supply with safe simultaneous USB-C support), consolidates field wiring to a single terminal strip, and adds a replaceable glass fuse.</w:t>
+        <w:t>This document specifies the design and production plan for SprinKlr-8: a compact, low-cost ESP32-based irrigation controller with 8 independently switched zones. Optimized for volume production at JLCPCB using all-SMD components sourced through LCSC. v1.1 revises the power architecture (24VAC field supply with safe simultaneous USB-C support), consolidates field wiring to a single terminal strip, and adds a replaceable glass fuse.</w:t>
       </w:r>
     </w:p>
     <w:p>
@@ -650,7 +650,7 @@
         <w:pStyle w:val="ListBullet"/>
       </w:pPr>
       <w:r>
-        <w:t>When USB only: Schottky diode forward-biased; board runs at ~4.6V -- fully functional for programming and testing</w:t>
+        <w:t>When USB only: Schottky diode forward-biased; board runs at ~4.6V -- fully functional</w:t>
       </w:r>
     </w:p>
     <w:p>
@@ -1499,7 +1499,7 @@
     <w:p/>
     <w:p>
       <w:r>
-        <w:t>Field wiring: transformer secondary connects to Pins 1-2. The common valve wire connects to Pin 3 (VALVE_COM). Each individual valve hot wire connects to the corresponding zone pin (4-11). This matches the wiring convention of all major commercial controllers.</w:t>
+        <w:t>Field wiring: transformer secondary to Pins 1-2; common valve wire to Pin 3 (VALVE_COM); individual valve hot wires to Pins 4-11. Matches wiring convention of all major commercial controllers.</w:t>
       </w:r>
     </w:p>
     <w:p>
@@ -1512,7 +1512,7 @@
     </w:p>
     <w:p>
       <w:r>
-        <w:t>The CH340C USB-UART bridge connects the USB-C port to the ESP32's UART0. Arduino IDE-compatible flashing without external hardware. Boot mode: hold BOOT, tap RESET. USB-C can remain connected while the board is powered from 24VAC -- the Schottky diode ensures the host computer is fully protected.</w:t>
+        <w:t>The CH340C USB-UART bridge connects the USB-C port to the ESP32 UART0. Arduino IDE-compatible flashing without external hardware. Boot mode: hold BOOT, tap RESET. USB-C can remain connected while the board is powered from 24VAC -- the Schottky diode ensures the host computer is fully protected.</w:t>
       </w:r>
     </w:p>
     <w:p>
@@ -1536,7 +1536,7 @@
     </w:p>
     <w:p>
       <w:r>
-        <w:t>Each zone has a dedicated 0402 green LED between 3.3V and the GPIO through a 470-ohm resistor. A red power LED indicates the board is energised from either supply source.</w:t>
+        <w:t>Each zone has a dedicated 0402 green LED (D1-D8) between 3.3V and the GPIO through a 470-ohm resistor. A red power LED (D9) with 1k-ohm resistor indicates the board is energised from either supply source.</w:t>
       </w:r>
     </w:p>
     <w:p>
@@ -1962,7 +1962,7 @@
     </w:p>
     <w:p>
       <w:r>
-        <w:t>All components available through LCSC Electronics via the JLCPCB component library. Part numbers current as of April 2026 -- verify availability at time of order.</w:t>
+        <w:t>Complete component list. All parts available through LCSC Electronics via the JLCPCB component library. Part numbers current as of April 2026 -- verify availability at time of order.</w:t>
       </w:r>
     </w:p>
     <w:tbl>
@@ -3458,7 +3458,7 @@
               <w:rPr>
                 <w:sz w:val="16"/>
               </w:rPr>
-              <w:t>USB 5V to rail; blocks back-feed to host</w:t>
+              <w:t>USB 5V to 5V rail; blocks back-feed to host</w:t>
             </w:r>
           </w:p>
         </w:tc>
@@ -3481,7 +3481,7 @@
                 <w:b/>
                 <w:sz w:val="16"/>
               </w:rPr>
-              <w:t>K1-8</w:t>
+              <w:t>T1, T2</w:t>
             </w:r>
           </w:p>
         </w:tc>
@@ -3501,7 +3501,7 @@
               <w:rPr>
                 <w:sz w:val="16"/>
               </w:rPr>
-              <w:t>SPST-NO Relay 5V 5A HF46F-G</w:t>
+              <w:t>MMBT3904 NPN SOT-23</w:t>
             </w:r>
           </w:p>
         </w:tc>
@@ -3521,7 +3521,7 @@
               <w:rPr>
                 <w:sz w:val="16"/>
               </w:rPr>
-              <w:t>C165255</w:t>
+              <w:t>C20526</w:t>
             </w:r>
           </w:p>
         </w:tc>
@@ -3541,7 +3541,7 @@
               <w:rPr>
                 <w:sz w:val="16"/>
               </w:rPr>
-              <w:t>8</w:t>
+              <w:t>2</w:t>
             </w:r>
           </w:p>
         </w:tc>
@@ -3561,7 +3561,7 @@
               <w:rPr>
                 <w:sz w:val="16"/>
               </w:rPr>
-              <w:t>$0.55</w:t>
+              <w:t>$0.05</w:t>
             </w:r>
           </w:p>
         </w:tc>
@@ -3581,7 +3581,7 @@
               <w:rPr>
                 <w:sz w:val="16"/>
               </w:rPr>
-              <w:t>$0.22</w:t>
+              <w:t>$0.03</w:t>
             </w:r>
           </w:p>
         </w:tc>
@@ -3601,7 +3601,7 @@
               <w:rPr>
                 <w:sz w:val="16"/>
               </w:rPr>
-              <w:t>$0.16</w:t>
+              <w:t>$0.02</w:t>
             </w:r>
           </w:p>
         </w:tc>
@@ -3621,7 +3621,7 @@
               <w:rPr>
                 <w:sz w:val="16"/>
               </w:rPr>
-              <w:t>5A@250VAC, SMD gull-wing</w:t>
+              <w:t>Auto-reset circuit -- allows IDE to flash without pressing buttons</w:t>
             </w:r>
           </w:p>
         </w:tc>
@@ -3644,7 +3644,7 @@
                 <w:b/>
                 <w:sz w:val="16"/>
               </w:rPr>
-              <w:t>J1</w:t>
+              <w:t>K1-K8</w:t>
             </w:r>
           </w:p>
         </w:tc>
@@ -3664,7 +3664,7 @@
               <w:rPr>
                 <w:sz w:val="16"/>
               </w:rPr>
-              <w:t>USB-C 16-pin SMD Receptacle</w:t>
+              <w:t>SPST-NO Relay 5V 5A HF46F-G</w:t>
             </w:r>
           </w:p>
         </w:tc>
@@ -3684,7 +3684,7 @@
               <w:rPr>
                 <w:sz w:val="16"/>
               </w:rPr>
-              <w:t>C165948</w:t>
+              <w:t>C165255</w:t>
             </w:r>
           </w:p>
         </w:tc>
@@ -3704,7 +3704,7 @@
               <w:rPr>
                 <w:sz w:val="16"/>
               </w:rPr>
-              <w:t>1</w:t>
+              <w:t>8</w:t>
             </w:r>
           </w:p>
         </w:tc>
@@ -3724,7 +3724,7 @@
               <w:rPr>
                 <w:sz w:val="16"/>
               </w:rPr>
-              <w:t>$0.25</w:t>
+              <w:t>$0.55</w:t>
             </w:r>
           </w:p>
         </w:tc>
@@ -3744,7 +3744,7 @@
               <w:rPr>
                 <w:sz w:val="16"/>
               </w:rPr>
-              <w:t>$0.12</w:t>
+              <w:t>$0.22</w:t>
             </w:r>
           </w:p>
         </w:tc>
@@ -3764,7 +3764,7 @@
               <w:rPr>
                 <w:sz w:val="16"/>
               </w:rPr>
-              <w:t>$0.08</w:t>
+              <w:t>$0.16</w:t>
             </w:r>
           </w:p>
         </w:tc>
@@ -3784,7 +3784,7 @@
               <w:rPr>
                 <w:sz w:val="16"/>
               </w:rPr>
-              <w:t>Programming + bench power (via Schottky)</w:t>
+              <w:t>5A@250VAC, SMD gull-wing</w:t>
             </w:r>
           </w:p>
         </w:tc>
@@ -3807,7 +3807,7 @@
                 <w:b/>
                 <w:sz w:val="16"/>
               </w:rPr>
-              <w:t>J2</w:t>
+              <w:t>J1</w:t>
             </w:r>
           </w:p>
         </w:tc>
@@ -3827,7 +3827,7 @@
               <w:rPr>
                 <w:sz w:val="16"/>
               </w:rPr>
-              <w:t>11-pin 5.08mm Screw Terminal</w:t>
+              <w:t>USB-C 16-pin SMD Receptacle</w:t>
             </w:r>
           </w:p>
         </w:tc>
@@ -3847,7 +3847,7 @@
               <w:rPr>
                 <w:sz w:val="16"/>
               </w:rPr>
-              <w:t>C8463</w:t>
+              <w:t>C165948</w:t>
             </w:r>
           </w:p>
         </w:tc>
@@ -3887,7 +3887,7 @@
               <w:rPr>
                 <w:sz w:val="16"/>
               </w:rPr>
-              <w:t>$0.65</w:t>
+              <w:t>$0.25</w:t>
             </w:r>
           </w:p>
         </w:tc>
@@ -3907,7 +3907,7 @@
               <w:rPr>
                 <w:sz w:val="16"/>
               </w:rPr>
-              <w:t>$0.38</w:t>
+              <w:t>$0.12</w:t>
             </w:r>
           </w:p>
         </w:tc>
@@ -3927,7 +3927,7 @@
               <w:rPr>
                 <w:sz w:val="16"/>
               </w:rPr>
-              <w:t>$0.28</w:t>
+              <w:t>$0.08</w:t>
             </w:r>
           </w:p>
         </w:tc>
@@ -3947,7 +3947,7 @@
               <w:rPr>
                 <w:sz w:val="16"/>
               </w:rPr>
-              <w:t>AC_LINE/NEUTRAL, VALVE_COM, ZONE1-8</w:t>
+              <w:t>Programming + bench power (via D12 Schottky)</w:t>
             </w:r>
           </w:p>
         </w:tc>
@@ -3970,7 +3970,7 @@
                 <w:b/>
                 <w:sz w:val="16"/>
               </w:rPr>
-              <w:t>F1</w:t>
+              <w:t>J2</w:t>
             </w:r>
           </w:p>
         </w:tc>
@@ -3990,7 +3990,7 @@
               <w:rPr>
                 <w:sz w:val="16"/>
               </w:rPr>
-              <w:t>PCB-mount 5x20mm Fuse Holder</w:t>
+              <w:t>11-pin 5.08mm Screw Terminal</w:t>
             </w:r>
           </w:p>
         </w:tc>
@@ -4010,7 +4010,7 @@
               <w:rPr>
                 <w:sz w:val="16"/>
               </w:rPr>
-              <w:t>C2897491</w:t>
+              <w:t>C8463</w:t>
             </w:r>
           </w:p>
         </w:tc>
@@ -4050,7 +4050,7 @@
               <w:rPr>
                 <w:sz w:val="16"/>
               </w:rPr>
-              <w:t>$0.35</w:t>
+              <w:t>$0.65</w:t>
             </w:r>
           </w:p>
         </w:tc>
@@ -4070,7 +4070,7 @@
               <w:rPr>
                 <w:sz w:val="16"/>
               </w:rPr>
-              <w:t>$0.18</w:t>
+              <w:t>$0.38</w:t>
             </w:r>
           </w:p>
         </w:tc>
@@ -4090,7 +4090,7 @@
               <w:rPr>
                 <w:sz w:val="16"/>
               </w:rPr>
-              <w:t>$0.12</w:t>
+              <w:t>$0.28</w:t>
             </w:r>
           </w:p>
         </w:tc>
@@ -4110,7 +4110,7 @@
               <w:rPr>
                 <w:sz w:val="16"/>
               </w:rPr>
-              <w:t>Install 1A slow-blow glass fuse</w:t>
+              <w:t>AC_LINE/NEUTRAL, VALVE_COM, ZONE1-8</w:t>
             </w:r>
           </w:p>
         </w:tc>
@@ -4133,7 +4133,7 @@
                 <w:b/>
                 <w:sz w:val="16"/>
               </w:rPr>
-              <w:t>L1</w:t>
+              <w:t>F1</w:t>
             </w:r>
           </w:p>
         </w:tc>
@@ -4153,7 +4153,7 @@
               <w:rPr>
                 <w:sz w:val="16"/>
               </w:rPr>
-              <w:t>100uH SMD Inductor</w:t>
+              <w:t>PCB-mount 5x20mm Fuse Holder</w:t>
             </w:r>
           </w:p>
         </w:tc>
@@ -4173,7 +4173,7 @@
               <w:rPr>
                 <w:sz w:val="16"/>
               </w:rPr>
-              <w:t>C408444</w:t>
+              <w:t>C2897491</w:t>
             </w:r>
           </w:p>
         </w:tc>
@@ -4213,7 +4213,7 @@
               <w:rPr>
                 <w:sz w:val="16"/>
               </w:rPr>
-              <w:t>$0.28</w:t>
+              <w:t>$0.35</w:t>
             </w:r>
           </w:p>
         </w:tc>
@@ -4233,7 +4233,7 @@
               <w:rPr>
                 <w:sz w:val="16"/>
               </w:rPr>
-              <w:t>$0.14</w:t>
+              <w:t>$0.18</w:t>
             </w:r>
           </w:p>
         </w:tc>
@@ -4253,7 +4253,7 @@
               <w:rPr>
                 <w:sz w:val="16"/>
               </w:rPr>
-              <w:t>$0.10</w:t>
+              <w:t>$0.12</w:t>
             </w:r>
           </w:p>
         </w:tc>
@@ -4273,7 +4273,7 @@
               <w:rPr>
                 <w:sz w:val="16"/>
               </w:rPr>
-              <w:t>LM2596S-5.0 output filter -- required</w:t>
+              <w:t>Install 1A slow-blow glass fuse</w:t>
             </w:r>
           </w:p>
         </w:tc>
@@ -4296,7 +4296,7 @@
                 <w:b/>
                 <w:sz w:val="16"/>
               </w:rPr>
-              <w:t>C1</w:t>
+              <w:t>L1</w:t>
             </w:r>
           </w:p>
         </w:tc>
@@ -4316,7 +4316,7 @@
               <w:rPr>
                 <w:sz w:val="16"/>
               </w:rPr>
-              <w:t>470uF 50V Electrolytic Radial</w:t>
+              <w:t>100uH SMD Inductor</w:t>
             </w:r>
           </w:p>
         </w:tc>
@@ -4336,7 +4336,7 @@
               <w:rPr>
                 <w:sz w:val="16"/>
               </w:rPr>
-              <w:t>C176680</w:t>
+              <w:t>C408444</w:t>
             </w:r>
           </w:p>
         </w:tc>
@@ -4376,7 +4376,7 @@
               <w:rPr>
                 <w:sz w:val="16"/>
               </w:rPr>
-              <w:t>$0.35</w:t>
+              <w:t>$0.28</w:t>
             </w:r>
           </w:p>
         </w:tc>
@@ -4396,7 +4396,7 @@
               <w:rPr>
                 <w:sz w:val="16"/>
               </w:rPr>
-              <w:t>$0.18</w:t>
+              <w:t>$0.14</w:t>
             </w:r>
           </w:p>
         </w:tc>
@@ -4416,7 +4416,7 @@
               <w:rPr>
                 <w:sz w:val="16"/>
               </w:rPr>
-              <w:t>$0.12</w:t>
+              <w:t>$0.10</w:t>
             </w:r>
           </w:p>
         </w:tc>
@@ -4436,7 +4436,7 @@
               <w:rPr>
                 <w:sz w:val="16"/>
               </w:rPr>
-              <w:t>Rectifier bulk cap -- 50V rating required</w:t>
+              <w:t>LM2596S-5.0 output filter -- required</w:t>
             </w:r>
           </w:p>
         </w:tc>
@@ -4459,7 +4459,7 @@
                 <w:b/>
                 <w:sz w:val="16"/>
               </w:rPr>
-              <w:t>C2</w:t>
+              <w:t>C1</w:t>
             </w:r>
           </w:p>
         </w:tc>
@@ -4479,7 +4479,7 @@
               <w:rPr>
                 <w:sz w:val="16"/>
               </w:rPr>
-              <w:t>220uF 10V Electrolytic SMD</w:t>
+              <w:t>470uF 50V Electrolytic Radial</w:t>
             </w:r>
           </w:p>
         </w:tc>
@@ -4499,7 +4499,7 @@
               <w:rPr>
                 <w:sz w:val="16"/>
               </w:rPr>
-              <w:t>C176672</w:t>
+              <w:t>C176680</w:t>
             </w:r>
           </w:p>
         </w:tc>
@@ -4539,7 +4539,7 @@
               <w:rPr>
                 <w:sz w:val="16"/>
               </w:rPr>
-              <w:t>$0.18</w:t>
+              <w:t>$0.35</w:t>
             </w:r>
           </w:p>
         </w:tc>
@@ -4559,7 +4559,7 @@
               <w:rPr>
                 <w:sz w:val="16"/>
               </w:rPr>
-              <w:t>$0.08</w:t>
+              <w:t>$0.18</w:t>
             </w:r>
           </w:p>
         </w:tc>
@@ -4579,7 +4579,7 @@
               <w:rPr>
                 <w:sz w:val="16"/>
               </w:rPr>
-              <w:t>$0.06</w:t>
+              <w:t>$0.12</w:t>
             </w:r>
           </w:p>
         </w:tc>
@@ -4599,7 +4599,7 @@
               <w:rPr>
                 <w:sz w:val="16"/>
               </w:rPr>
-              <w:t>Buck output filter cap</w:t>
+              <w:t>Rectifier bulk cap -- 50V rating required</w:t>
             </w:r>
           </w:p>
         </w:tc>
@@ -4622,7 +4622,7 @@
                 <w:b/>
                 <w:sz w:val="16"/>
               </w:rPr>
-              <w:t>C3-6</w:t>
+              <w:t>C2</w:t>
             </w:r>
           </w:p>
         </w:tc>
@@ -4642,7 +4642,7 @@
               <w:rPr>
                 <w:sz w:val="16"/>
               </w:rPr>
-              <w:t>100nF 0402 MLCC x4</w:t>
+              <w:t>220uF 10V Electrolytic SMD</w:t>
             </w:r>
           </w:p>
         </w:tc>
@@ -4662,7 +4662,7 @@
               <w:rPr>
                 <w:sz w:val="16"/>
               </w:rPr>
-              <w:t>C1525</w:t>
+              <w:t>C176672</w:t>
             </w:r>
           </w:p>
         </w:tc>
@@ -4682,7 +4682,7 @@
               <w:rPr>
                 <w:sz w:val="16"/>
               </w:rPr>
-              <w:t>4</w:t>
+              <w:t>1</w:t>
             </w:r>
           </w:p>
         </w:tc>
@@ -4702,7 +4702,7 @@
               <w:rPr>
                 <w:sz w:val="16"/>
               </w:rPr>
-              <w:t>$0.02</w:t>
+              <w:t>$0.18</w:t>
             </w:r>
           </w:p>
         </w:tc>
@@ -4722,7 +4722,7 @@
               <w:rPr>
                 <w:sz w:val="16"/>
               </w:rPr>
-              <w:t>$0.01</w:t>
+              <w:t>$0.08</w:t>
             </w:r>
           </w:p>
         </w:tc>
@@ -4742,7 +4742,7 @@
               <w:rPr>
                 <w:sz w:val="16"/>
               </w:rPr>
-              <w:t>$0.01</w:t>
+              <w:t>$0.06</w:t>
             </w:r>
           </w:p>
         </w:tc>
@@ -4762,7 +4762,7 @@
               <w:rPr>
                 <w:sz w:val="16"/>
               </w:rPr>
-              <w:t>Decoupling</w:t>
+              <w:t>Buck output filter cap</w:t>
             </w:r>
           </w:p>
         </w:tc>
@@ -4785,7 +4785,7 @@
                 <w:b/>
                 <w:sz w:val="16"/>
               </w:rPr>
-              <w:t>R1-8</w:t>
+              <w:t>C3-C6</w:t>
             </w:r>
           </w:p>
         </w:tc>
@@ -4805,7 +4805,7 @@
               <w:rPr>
                 <w:sz w:val="16"/>
               </w:rPr>
-              <w:t>1k-ohm 0402 x8</w:t>
+              <w:t>100nF 0402 MLCC x4</w:t>
             </w:r>
           </w:p>
         </w:tc>
@@ -4825,7 +4825,7 @@
               <w:rPr>
                 <w:sz w:val="16"/>
               </w:rPr>
-              <w:t>C11702</w:t>
+              <w:t>C1525</w:t>
             </w:r>
           </w:p>
         </w:tc>
@@ -4845,7 +4845,7 @@
               <w:rPr>
                 <w:sz w:val="16"/>
               </w:rPr>
-              <w:t>8</w:t>
+              <w:t>4</w:t>
             </w:r>
           </w:p>
         </w:tc>
@@ -4865,7 +4865,7 @@
               <w:rPr>
                 <w:sz w:val="16"/>
               </w:rPr>
-              <w:t>$0.01</w:t>
+              <w:t>$0.02</w:t>
             </w:r>
           </w:p>
         </w:tc>
@@ -4885,7 +4885,7 @@
               <w:rPr>
                 <w:sz w:val="16"/>
               </w:rPr>
-              <w:t>$0.005</w:t>
+              <w:t>$0.01</w:t>
             </w:r>
           </w:p>
         </w:tc>
@@ -4905,7 +4905,7 @@
               <w:rPr>
                 <w:sz w:val="16"/>
               </w:rPr>
-              <w:t>$0.003</w:t>
+              <w:t>$0.01</w:t>
             </w:r>
           </w:p>
         </w:tc>
@@ -4925,7 +4925,7 @@
               <w:rPr>
                 <w:sz w:val="16"/>
               </w:rPr>
-              <w:t>Relay drive resistors</w:t>
+              <w:t>IC decoupling caps</w:t>
             </w:r>
           </w:p>
         </w:tc>
@@ -4948,7 +4948,7 @@
                 <w:b/>
                 <w:sz w:val="16"/>
               </w:rPr>
-              <w:t>R9-16</w:t>
+              <w:t>R1-R8</w:t>
             </w:r>
           </w:p>
         </w:tc>
@@ -4968,7 +4968,7 @@
               <w:rPr>
                 <w:sz w:val="16"/>
               </w:rPr>
-              <w:t>470-ohm 0402 x8</w:t>
+              <w:t>1k-ohm 0402 x8</w:t>
             </w:r>
           </w:p>
         </w:tc>
@@ -4988,7 +4988,7 @@
               <w:rPr>
                 <w:sz w:val="16"/>
               </w:rPr>
-              <w:t>C23190</w:t>
+              <w:t>C11702</w:t>
             </w:r>
           </w:p>
         </w:tc>
@@ -5088,7 +5088,7 @@
               <w:rPr>
                 <w:sz w:val="16"/>
               </w:rPr>
-              <w:t>Zone LED resistors</w:t>
+              <w:t>Relay GPIO drive resistors</w:t>
             </w:r>
           </w:p>
         </w:tc>
@@ -5111,7 +5111,7 @@
                 <w:b/>
                 <w:sz w:val="16"/>
               </w:rPr>
-              <w:t>D1-8</w:t>
+              <w:t>R9-R16</w:t>
             </w:r>
           </w:p>
         </w:tc>
@@ -5131,7 +5131,7 @@
               <w:rPr>
                 <w:sz w:val="16"/>
               </w:rPr>
-              <w:t>LED 0402 green x8</w:t>
+              <w:t>470-ohm 0402 x8</w:t>
             </w:r>
           </w:p>
         </w:tc>
@@ -5151,7 +5151,7 @@
               <w:rPr>
                 <w:sz w:val="16"/>
               </w:rPr>
-              <w:t>C72043</w:t>
+              <w:t>C23190</w:t>
             </w:r>
           </w:p>
         </w:tc>
@@ -5191,7 +5191,7 @@
               <w:rPr>
                 <w:sz w:val="16"/>
               </w:rPr>
-              <w:t>$0.05</w:t>
+              <w:t>$0.01</w:t>
             </w:r>
           </w:p>
         </w:tc>
@@ -5211,7 +5211,7 @@
               <w:rPr>
                 <w:sz w:val="16"/>
               </w:rPr>
-              <w:t>$0.025</w:t>
+              <w:t>$0.005</w:t>
             </w:r>
           </w:p>
         </w:tc>
@@ -5231,7 +5231,7 @@
               <w:rPr>
                 <w:sz w:val="16"/>
               </w:rPr>
-              <w:t>$0.018</w:t>
+              <w:t>$0.003</w:t>
             </w:r>
           </w:p>
         </w:tc>
@@ -5251,7 +5251,7 @@
               <w:rPr>
                 <w:sz w:val="16"/>
               </w:rPr>
-              <w:t>Zone active indicators</w:t>
+              <w:t>Zone LED current resistors</w:t>
             </w:r>
           </w:p>
         </w:tc>
@@ -5274,7 +5274,7 @@
                 <w:b/>
                 <w:sz w:val="16"/>
               </w:rPr>
-              <w:t>D9</w:t>
+              <w:t>R17-R21</w:t>
             </w:r>
           </w:p>
         </w:tc>
@@ -5294,7 +5294,7 @@
               <w:rPr>
                 <w:sz w:val="16"/>
               </w:rPr>
-              <w:t>LED 0402 red</w:t>
+              <w:t>10k-ohm 0402 x5</w:t>
             </w:r>
           </w:p>
         </w:tc>
@@ -5314,7 +5314,7 @@
               <w:rPr>
                 <w:sz w:val="16"/>
               </w:rPr>
-              <w:t>C84256</w:t>
+              <w:t>C25804</w:t>
             </w:r>
           </w:p>
         </w:tc>
@@ -5334,7 +5334,7 @@
               <w:rPr>
                 <w:sz w:val="16"/>
               </w:rPr>
-              <w:t>1</w:t>
+              <w:t>5</w:t>
             </w:r>
           </w:p>
         </w:tc>
@@ -5354,7 +5354,7 @@
               <w:rPr>
                 <w:sz w:val="16"/>
               </w:rPr>
-              <w:t>$0.05</w:t>
+              <w:t>$0.01</w:t>
             </w:r>
           </w:p>
         </w:tc>
@@ -5374,7 +5374,7 @@
               <w:rPr>
                 <w:sz w:val="16"/>
               </w:rPr>
-              <w:t>$0.025</w:t>
+              <w:t>$0.005</w:t>
             </w:r>
           </w:p>
         </w:tc>
@@ -5394,7 +5394,7 @@
               <w:rPr>
                 <w:sz w:val="16"/>
               </w:rPr>
-              <w:t>$0.018</w:t>
+              <w:t>$0.003</w:t>
             </w:r>
           </w:p>
         </w:tc>
@@ -5414,7 +5414,7 @@
               <w:rPr>
                 <w:sz w:val="16"/>
               </w:rPr>
-              <w:t>Power-on indicator</w:t>
+              <w:t>EN/BOOT pull-ups, GPIO12 pull-down, DTR/RTS base resistors</w:t>
             </w:r>
           </w:p>
         </w:tc>
@@ -5437,7 +5437,7 @@
                 <w:b/>
                 <w:sz w:val="16"/>
               </w:rPr>
-              <w:t>SW1</w:t>
+              <w:t>R22-R23</w:t>
             </w:r>
           </w:p>
         </w:tc>
@@ -5457,7 +5457,7 @@
               <w:rPr>
                 <w:sz w:val="16"/>
               </w:rPr>
-              <w:t>BOOT tactile switch SMD</w:t>
+              <w:t>5.1k-ohm 0402 x2</w:t>
             </w:r>
           </w:p>
         </w:tc>
@@ -5477,7 +5477,7 @@
               <w:rPr>
                 <w:sz w:val="16"/>
               </w:rPr>
-              <w:t>C318884</w:t>
+              <w:t>C27864</w:t>
             </w:r>
           </w:p>
         </w:tc>
@@ -5497,7 +5497,7 @@
               <w:rPr>
                 <w:sz w:val="16"/>
               </w:rPr>
-              <w:t>1</w:t>
+              <w:t>2</w:t>
             </w:r>
           </w:p>
         </w:tc>
@@ -5517,7 +5517,7 @@
               <w:rPr>
                 <w:sz w:val="16"/>
               </w:rPr>
-              <w:t>$0.08</w:t>
+              <w:t>$0.01</w:t>
             </w:r>
           </w:p>
         </w:tc>
@@ -5537,7 +5537,7 @@
               <w:rPr>
                 <w:sz w:val="16"/>
               </w:rPr>
-              <w:t>$0.04</w:t>
+              <w:t>$0.005</w:t>
             </w:r>
           </w:p>
         </w:tc>
@@ -5557,7 +5557,7 @@
               <w:rPr>
                 <w:sz w:val="16"/>
               </w:rPr>
-              <w:t>$0.03</w:t>
+              <w:t>$0.003</w:t>
             </w:r>
           </w:p>
         </w:tc>
@@ -5577,7 +5577,7 @@
               <w:rPr>
                 <w:sz w:val="16"/>
               </w:rPr>
-              <w:t>Enter flash mode</w:t>
+              <w:t>USB-C CC1 and CC2 resistors (mandatory for USB-C detection)</w:t>
             </w:r>
           </w:p>
         </w:tc>
@@ -5600,7 +5600,7 @@
                 <w:b/>
                 <w:sz w:val="16"/>
               </w:rPr>
-              <w:t>SW2</w:t>
+              <w:t>R24</w:t>
             </w:r>
           </w:p>
         </w:tc>
@@ -5620,7 +5620,7 @@
               <w:rPr>
                 <w:sz w:val="16"/>
               </w:rPr>
-              <w:t>EN/RESET tactile switch SMD</w:t>
+              <w:t>1k-ohm 0402 x1</w:t>
             </w:r>
           </w:p>
         </w:tc>
@@ -5640,7 +5640,7 @@
               <w:rPr>
                 <w:sz w:val="16"/>
               </w:rPr>
-              <w:t>C318884</w:t>
+              <w:t>C11702</w:t>
             </w:r>
           </w:p>
         </w:tc>
@@ -5680,7 +5680,7 @@
               <w:rPr>
                 <w:sz w:val="16"/>
               </w:rPr>
-              <w:t>$0.08</w:t>
+              <w:t>$0.01</w:t>
             </w:r>
           </w:p>
         </w:tc>
@@ -5700,7 +5700,7 @@
               <w:rPr>
                 <w:sz w:val="16"/>
               </w:rPr>
-              <w:t>$0.04</w:t>
+              <w:t>$0.005</w:t>
             </w:r>
           </w:p>
         </w:tc>
@@ -5720,7 +5720,7 @@
               <w:rPr>
                 <w:sz w:val="16"/>
               </w:rPr>
-              <w:t>$0.03</w:t>
+              <w:t>$0.003</w:t>
             </w:r>
           </w:p>
         </w:tc>
@@ -5740,7 +5740,7 @@
               <w:rPr>
                 <w:sz w:val="16"/>
               </w:rPr>
-              <w:t>Reset ESP32</w:t>
+              <w:t>Power LED (D9) current resistor</w:t>
             </w:r>
           </w:p>
         </w:tc>
@@ -5763,7 +5763,7 @@
                 <w:b/>
                 <w:sz w:val="16"/>
               </w:rPr>
-              <w:t>--</w:t>
+              <w:t>D1-D8</w:t>
             </w:r>
           </w:p>
         </w:tc>
@@ -5783,7 +5783,7 @@
               <w:rPr>
                 <w:sz w:val="16"/>
               </w:rPr>
-              <w:t>PCB (2-layer ~90x65mm)</w:t>
+              <w:t>LED 0402 green x8</w:t>
             </w:r>
           </w:p>
         </w:tc>
@@ -5803,7 +5803,7 @@
               <w:rPr>
                 <w:sz w:val="16"/>
               </w:rPr>
-              <w:t>JLCPCB</w:t>
+              <w:t>C72043</w:t>
             </w:r>
           </w:p>
         </w:tc>
@@ -5823,7 +5823,7 @@
               <w:rPr>
                 <w:sz w:val="16"/>
               </w:rPr>
-              <w:t>1</w:t>
+              <w:t>8</w:t>
             </w:r>
           </w:p>
         </w:tc>
@@ -5843,7 +5843,7 @@
               <w:rPr>
                 <w:sz w:val="16"/>
               </w:rPr>
-              <w:t>$2.00</w:t>
+              <w:t>$0.05</w:t>
             </w:r>
           </w:p>
         </w:tc>
@@ -5863,7 +5863,7 @@
               <w:rPr>
                 <w:sz w:val="16"/>
               </w:rPr>
-              <w:t>$0.80</w:t>
+              <w:t>$0.025</w:t>
             </w:r>
           </w:p>
         </w:tc>
@@ -5883,7 +5883,7 @@
               <w:rPr>
                 <w:sz w:val="16"/>
               </w:rPr>
-              <w:t>$0.45</w:t>
+              <w:t>$0.018</w:t>
             </w:r>
           </w:p>
         </w:tc>
@@ -5903,7 +5903,7 @@
               <w:rPr>
                 <w:sz w:val="16"/>
               </w:rPr>
-              <w:t>2-layer, HASL or ENIG finish</w:t>
+              <w:t>Zone active indicators</w:t>
             </w:r>
           </w:p>
         </w:tc>
@@ -5926,7 +5926,7 @@
                 <w:b/>
                 <w:sz w:val="16"/>
               </w:rPr>
-              <w:t>--</w:t>
+              <w:t>D9</w:t>
             </w:r>
           </w:p>
         </w:tc>
@@ -5946,7 +5946,7 @@
               <w:rPr>
                 <w:sz w:val="16"/>
               </w:rPr>
-              <w:t>SMT Assembly</w:t>
+              <w:t>LED 0402 red</w:t>
             </w:r>
           </w:p>
         </w:tc>
@@ -5966,7 +5966,7 @@
               <w:rPr>
                 <w:sz w:val="16"/>
               </w:rPr>
-              <w:t>JLCPCB</w:t>
+              <w:t>C84256</w:t>
             </w:r>
           </w:p>
         </w:tc>
@@ -6006,7 +6006,7 @@
               <w:rPr>
                 <w:sz w:val="16"/>
               </w:rPr>
-              <w:t>$8.00</w:t>
+              <w:t>$0.05</w:t>
             </w:r>
           </w:p>
         </w:tc>
@@ -6026,7 +6026,7 @@
               <w:rPr>
                 <w:sz w:val="16"/>
               </w:rPr>
-              <w:t>$3.50</w:t>
+              <w:t>$0.025</w:t>
             </w:r>
           </w:p>
         </w:tc>
@@ -6046,7 +6046,7 @@
               <w:rPr>
                 <w:sz w:val="16"/>
               </w:rPr>
-              <w:t>$2.00</w:t>
+              <w:t>$0.018</w:t>
             </w:r>
           </w:p>
         </w:tc>
@@ -6066,7 +6066,7 @@
               <w:rPr>
                 <w:sz w:val="16"/>
               </w:rPr>
-              <w:t>JLCPCB Economic SMT</w:t>
+              <w:t>Power-on indicator</w:t>
             </w:r>
           </w:p>
         </w:tc>
@@ -6075,7 +6075,7 @@
         <w:tc>
           <w:tcPr>
             <w:tcW w:type="dxa" w:w="1170"/>
-            <w:shd w:val="clear" w:color="auto" w:fill="FFF2CC"/>
+            <w:shd w:val="clear" w:color="auto" w:fill="DCE6F1"/>
             <w:tcBorders>
               <w:top w:val="single" w:sz="4" w:space="0" w:color="AAAAAA"/>
               <w:bottom w:val="single" w:sz="4" w:space="0" w:color="AAAAAA"/>
@@ -6089,10 +6089,641 @@
                 <w:b/>
                 <w:sz w:val="16"/>
               </w:rPr>
-              <w:t>TOTAL</w:t>
-            </w:r>
-          </w:p>
-        </w:tc>
+              <w:t>SW1</w:t>
+            </w:r>
+          </w:p>
+        </w:tc>
+        <w:tc>
+          <w:tcPr>
+            <w:tcW w:type="dxa" w:w="1170"/>
+            <w:shd w:val="clear" w:color="auto" w:fill="DCE6F1"/>
+            <w:tcBorders>
+              <w:top w:val="single" w:sz="4" w:space="0" w:color="AAAAAA"/>
+              <w:bottom w:val="single" w:sz="4" w:space="0" w:color="AAAAAA"/>
+              <w:left w:val="single" w:sz="4" w:space="0" w:color="AAAAAA"/>
+              <w:right w:val="single" w:sz="4" w:space="0" w:color="AAAAAA"/>
+            </w:tcBorders>
+          </w:tcPr>
+          <w:p>
+            <w:r>
+              <w:rPr>
+                <w:sz w:val="16"/>
+              </w:rPr>
+              <w:t>BOOT tactile switch SMD</w:t>
+            </w:r>
+          </w:p>
+        </w:tc>
+        <w:tc>
+          <w:tcPr>
+            <w:tcW w:type="dxa" w:w="1170"/>
+            <w:shd w:val="clear" w:color="auto" w:fill="DCE6F1"/>
+            <w:tcBorders>
+              <w:top w:val="single" w:sz="4" w:space="0" w:color="AAAAAA"/>
+              <w:bottom w:val="single" w:sz="4" w:space="0" w:color="AAAAAA"/>
+              <w:left w:val="single" w:sz="4" w:space="0" w:color="AAAAAA"/>
+              <w:right w:val="single" w:sz="4" w:space="0" w:color="AAAAAA"/>
+            </w:tcBorders>
+          </w:tcPr>
+          <w:p>
+            <w:r>
+              <w:rPr>
+                <w:sz w:val="16"/>
+              </w:rPr>
+              <w:t>C318884</w:t>
+            </w:r>
+          </w:p>
+        </w:tc>
+        <w:tc>
+          <w:tcPr>
+            <w:tcW w:type="dxa" w:w="1170"/>
+            <w:shd w:val="clear" w:color="auto" w:fill="DCE6F1"/>
+            <w:tcBorders>
+              <w:top w:val="single" w:sz="4" w:space="0" w:color="AAAAAA"/>
+              <w:bottom w:val="single" w:sz="4" w:space="0" w:color="AAAAAA"/>
+              <w:left w:val="single" w:sz="4" w:space="0" w:color="AAAAAA"/>
+              <w:right w:val="single" w:sz="4" w:space="0" w:color="AAAAAA"/>
+            </w:tcBorders>
+          </w:tcPr>
+          <w:p>
+            <w:r>
+              <w:rPr>
+                <w:sz w:val="16"/>
+              </w:rPr>
+              <w:t>1</w:t>
+            </w:r>
+          </w:p>
+        </w:tc>
+        <w:tc>
+          <w:tcPr>
+            <w:tcW w:type="dxa" w:w="1170"/>
+            <w:shd w:val="clear" w:color="auto" w:fill="DCE6F1"/>
+            <w:tcBorders>
+              <w:top w:val="single" w:sz="4" w:space="0" w:color="AAAAAA"/>
+              <w:bottom w:val="single" w:sz="4" w:space="0" w:color="AAAAAA"/>
+              <w:left w:val="single" w:sz="4" w:space="0" w:color="AAAAAA"/>
+              <w:right w:val="single" w:sz="4" w:space="0" w:color="AAAAAA"/>
+            </w:tcBorders>
+          </w:tcPr>
+          <w:p>
+            <w:r>
+              <w:rPr>
+                <w:sz w:val="16"/>
+              </w:rPr>
+              <w:t>$0.08</w:t>
+            </w:r>
+          </w:p>
+        </w:tc>
+        <w:tc>
+          <w:tcPr>
+            <w:tcW w:type="dxa" w:w="1170"/>
+            <w:shd w:val="clear" w:color="auto" w:fill="DCE6F1"/>
+            <w:tcBorders>
+              <w:top w:val="single" w:sz="4" w:space="0" w:color="AAAAAA"/>
+              <w:bottom w:val="single" w:sz="4" w:space="0" w:color="AAAAAA"/>
+              <w:left w:val="single" w:sz="4" w:space="0" w:color="AAAAAA"/>
+              <w:right w:val="single" w:sz="4" w:space="0" w:color="AAAAAA"/>
+            </w:tcBorders>
+          </w:tcPr>
+          <w:p>
+            <w:r>
+              <w:rPr>
+                <w:sz w:val="16"/>
+              </w:rPr>
+              <w:t>$0.04</w:t>
+            </w:r>
+          </w:p>
+        </w:tc>
+        <w:tc>
+          <w:tcPr>
+            <w:tcW w:type="dxa" w:w="1170"/>
+            <w:shd w:val="clear" w:color="auto" w:fill="DCE6F1"/>
+            <w:tcBorders>
+              <w:top w:val="single" w:sz="4" w:space="0" w:color="AAAAAA"/>
+              <w:bottom w:val="single" w:sz="4" w:space="0" w:color="AAAAAA"/>
+              <w:left w:val="single" w:sz="4" w:space="0" w:color="AAAAAA"/>
+              <w:right w:val="single" w:sz="4" w:space="0" w:color="AAAAAA"/>
+            </w:tcBorders>
+          </w:tcPr>
+          <w:p>
+            <w:r>
+              <w:rPr>
+                <w:sz w:val="16"/>
+              </w:rPr>
+              <w:t>$0.03</w:t>
+            </w:r>
+          </w:p>
+        </w:tc>
+        <w:tc>
+          <w:tcPr>
+            <w:tcW w:type="dxa" w:w="1170"/>
+            <w:shd w:val="clear" w:color="auto" w:fill="DCE6F1"/>
+            <w:tcBorders>
+              <w:top w:val="single" w:sz="4" w:space="0" w:color="AAAAAA"/>
+              <w:bottom w:val="single" w:sz="4" w:space="0" w:color="AAAAAA"/>
+              <w:left w:val="single" w:sz="4" w:space="0" w:color="AAAAAA"/>
+              <w:right w:val="single" w:sz="4" w:space="0" w:color="AAAAAA"/>
+            </w:tcBorders>
+          </w:tcPr>
+          <w:p>
+            <w:r>
+              <w:rPr>
+                <w:sz w:val="16"/>
+              </w:rPr>
+              <w:t>Enter flash mode</w:t>
+            </w:r>
+          </w:p>
+        </w:tc>
+      </w:tr>
+      <w:tr>
+        <w:tc>
+          <w:tcPr>
+            <w:tcW w:type="dxa" w:w="1170"/>
+            <w:shd w:val="clear" w:color="auto" w:fill="FFFFFF"/>
+            <w:tcBorders>
+              <w:top w:val="single" w:sz="4" w:space="0" w:color="AAAAAA"/>
+              <w:bottom w:val="single" w:sz="4" w:space="0" w:color="AAAAAA"/>
+              <w:left w:val="single" w:sz="4" w:space="0" w:color="AAAAAA"/>
+              <w:right w:val="single" w:sz="4" w:space="0" w:color="AAAAAA"/>
+            </w:tcBorders>
+          </w:tcPr>
+          <w:p>
+            <w:r>
+              <w:rPr>
+                <w:b/>
+                <w:sz w:val="16"/>
+              </w:rPr>
+              <w:t>SW2</w:t>
+            </w:r>
+          </w:p>
+        </w:tc>
+        <w:tc>
+          <w:tcPr>
+            <w:tcW w:type="dxa" w:w="1170"/>
+            <w:shd w:val="clear" w:color="auto" w:fill="FFFFFF"/>
+            <w:tcBorders>
+              <w:top w:val="single" w:sz="4" w:space="0" w:color="AAAAAA"/>
+              <w:bottom w:val="single" w:sz="4" w:space="0" w:color="AAAAAA"/>
+              <w:left w:val="single" w:sz="4" w:space="0" w:color="AAAAAA"/>
+              <w:right w:val="single" w:sz="4" w:space="0" w:color="AAAAAA"/>
+            </w:tcBorders>
+          </w:tcPr>
+          <w:p>
+            <w:r>
+              <w:rPr>
+                <w:sz w:val="16"/>
+              </w:rPr>
+              <w:t>EN/RESET tactile switch SMD</w:t>
+            </w:r>
+          </w:p>
+        </w:tc>
+        <w:tc>
+          <w:tcPr>
+            <w:tcW w:type="dxa" w:w="1170"/>
+            <w:shd w:val="clear" w:color="auto" w:fill="FFFFFF"/>
+            <w:tcBorders>
+              <w:top w:val="single" w:sz="4" w:space="0" w:color="AAAAAA"/>
+              <w:bottom w:val="single" w:sz="4" w:space="0" w:color="AAAAAA"/>
+              <w:left w:val="single" w:sz="4" w:space="0" w:color="AAAAAA"/>
+              <w:right w:val="single" w:sz="4" w:space="0" w:color="AAAAAA"/>
+            </w:tcBorders>
+          </w:tcPr>
+          <w:p>
+            <w:r>
+              <w:rPr>
+                <w:sz w:val="16"/>
+              </w:rPr>
+              <w:t>C318884</w:t>
+            </w:r>
+          </w:p>
+        </w:tc>
+        <w:tc>
+          <w:tcPr>
+            <w:tcW w:type="dxa" w:w="1170"/>
+            <w:shd w:val="clear" w:color="auto" w:fill="FFFFFF"/>
+            <w:tcBorders>
+              <w:top w:val="single" w:sz="4" w:space="0" w:color="AAAAAA"/>
+              <w:bottom w:val="single" w:sz="4" w:space="0" w:color="AAAAAA"/>
+              <w:left w:val="single" w:sz="4" w:space="0" w:color="AAAAAA"/>
+              <w:right w:val="single" w:sz="4" w:space="0" w:color="AAAAAA"/>
+            </w:tcBorders>
+          </w:tcPr>
+          <w:p>
+            <w:r>
+              <w:rPr>
+                <w:sz w:val="16"/>
+              </w:rPr>
+              <w:t>1</w:t>
+            </w:r>
+          </w:p>
+        </w:tc>
+        <w:tc>
+          <w:tcPr>
+            <w:tcW w:type="dxa" w:w="1170"/>
+            <w:shd w:val="clear" w:color="auto" w:fill="FFFFFF"/>
+            <w:tcBorders>
+              <w:top w:val="single" w:sz="4" w:space="0" w:color="AAAAAA"/>
+              <w:bottom w:val="single" w:sz="4" w:space="0" w:color="AAAAAA"/>
+              <w:left w:val="single" w:sz="4" w:space="0" w:color="AAAAAA"/>
+              <w:right w:val="single" w:sz="4" w:space="0" w:color="AAAAAA"/>
+            </w:tcBorders>
+          </w:tcPr>
+          <w:p>
+            <w:r>
+              <w:rPr>
+                <w:sz w:val="16"/>
+              </w:rPr>
+              <w:t>$0.08</w:t>
+            </w:r>
+          </w:p>
+        </w:tc>
+        <w:tc>
+          <w:tcPr>
+            <w:tcW w:type="dxa" w:w="1170"/>
+            <w:shd w:val="clear" w:color="auto" w:fill="FFFFFF"/>
+            <w:tcBorders>
+              <w:top w:val="single" w:sz="4" w:space="0" w:color="AAAAAA"/>
+              <w:bottom w:val="single" w:sz="4" w:space="0" w:color="AAAAAA"/>
+              <w:left w:val="single" w:sz="4" w:space="0" w:color="AAAAAA"/>
+              <w:right w:val="single" w:sz="4" w:space="0" w:color="AAAAAA"/>
+            </w:tcBorders>
+          </w:tcPr>
+          <w:p>
+            <w:r>
+              <w:rPr>
+                <w:sz w:val="16"/>
+              </w:rPr>
+              <w:t>$0.04</w:t>
+            </w:r>
+          </w:p>
+        </w:tc>
+        <w:tc>
+          <w:tcPr>
+            <w:tcW w:type="dxa" w:w="1170"/>
+            <w:shd w:val="clear" w:color="auto" w:fill="FFFFFF"/>
+            <w:tcBorders>
+              <w:top w:val="single" w:sz="4" w:space="0" w:color="AAAAAA"/>
+              <w:bottom w:val="single" w:sz="4" w:space="0" w:color="AAAAAA"/>
+              <w:left w:val="single" w:sz="4" w:space="0" w:color="AAAAAA"/>
+              <w:right w:val="single" w:sz="4" w:space="0" w:color="AAAAAA"/>
+            </w:tcBorders>
+          </w:tcPr>
+          <w:p>
+            <w:r>
+              <w:rPr>
+                <w:sz w:val="16"/>
+              </w:rPr>
+              <w:t>$0.03</w:t>
+            </w:r>
+          </w:p>
+        </w:tc>
+        <w:tc>
+          <w:tcPr>
+            <w:tcW w:type="dxa" w:w="1170"/>
+            <w:shd w:val="clear" w:color="auto" w:fill="FFFFFF"/>
+            <w:tcBorders>
+              <w:top w:val="single" w:sz="4" w:space="0" w:color="AAAAAA"/>
+              <w:bottom w:val="single" w:sz="4" w:space="0" w:color="AAAAAA"/>
+              <w:left w:val="single" w:sz="4" w:space="0" w:color="AAAAAA"/>
+              <w:right w:val="single" w:sz="4" w:space="0" w:color="AAAAAA"/>
+            </w:tcBorders>
+          </w:tcPr>
+          <w:p>
+            <w:r>
+              <w:rPr>
+                <w:sz w:val="16"/>
+              </w:rPr>
+              <w:t>Reset ESP32</w:t>
+            </w:r>
+          </w:p>
+        </w:tc>
+      </w:tr>
+      <w:tr>
+        <w:tc>
+          <w:tcPr>
+            <w:tcW w:type="dxa" w:w="1170"/>
+            <w:shd w:val="clear" w:color="auto" w:fill="DCE6F1"/>
+            <w:tcBorders>
+              <w:top w:val="single" w:sz="4" w:space="0" w:color="AAAAAA"/>
+              <w:bottom w:val="single" w:sz="4" w:space="0" w:color="AAAAAA"/>
+              <w:left w:val="single" w:sz="4" w:space="0" w:color="AAAAAA"/>
+              <w:right w:val="single" w:sz="4" w:space="0" w:color="AAAAAA"/>
+            </w:tcBorders>
+          </w:tcPr>
+          <w:p>
+            <w:r>
+              <w:rPr>
+                <w:b/>
+                <w:sz w:val="16"/>
+              </w:rPr>
+              <w:t>--</w:t>
+            </w:r>
+          </w:p>
+        </w:tc>
+        <w:tc>
+          <w:tcPr>
+            <w:tcW w:type="dxa" w:w="1170"/>
+            <w:shd w:val="clear" w:color="auto" w:fill="DCE6F1"/>
+            <w:tcBorders>
+              <w:top w:val="single" w:sz="4" w:space="0" w:color="AAAAAA"/>
+              <w:bottom w:val="single" w:sz="4" w:space="0" w:color="AAAAAA"/>
+              <w:left w:val="single" w:sz="4" w:space="0" w:color="AAAAAA"/>
+              <w:right w:val="single" w:sz="4" w:space="0" w:color="AAAAAA"/>
+            </w:tcBorders>
+          </w:tcPr>
+          <w:p>
+            <w:r>
+              <w:rPr>
+                <w:sz w:val="16"/>
+              </w:rPr>
+              <w:t>PCB (2-layer ~90x65mm)</w:t>
+            </w:r>
+          </w:p>
+        </w:tc>
+        <w:tc>
+          <w:tcPr>
+            <w:tcW w:type="dxa" w:w="1170"/>
+            <w:shd w:val="clear" w:color="auto" w:fill="DCE6F1"/>
+            <w:tcBorders>
+              <w:top w:val="single" w:sz="4" w:space="0" w:color="AAAAAA"/>
+              <w:bottom w:val="single" w:sz="4" w:space="0" w:color="AAAAAA"/>
+              <w:left w:val="single" w:sz="4" w:space="0" w:color="AAAAAA"/>
+              <w:right w:val="single" w:sz="4" w:space="0" w:color="AAAAAA"/>
+            </w:tcBorders>
+          </w:tcPr>
+          <w:p>
+            <w:r>
+              <w:rPr>
+                <w:sz w:val="16"/>
+              </w:rPr>
+              <w:t>JLCPCB</w:t>
+            </w:r>
+          </w:p>
+        </w:tc>
+        <w:tc>
+          <w:tcPr>
+            <w:tcW w:type="dxa" w:w="1170"/>
+            <w:shd w:val="clear" w:color="auto" w:fill="DCE6F1"/>
+            <w:tcBorders>
+              <w:top w:val="single" w:sz="4" w:space="0" w:color="AAAAAA"/>
+              <w:bottom w:val="single" w:sz="4" w:space="0" w:color="AAAAAA"/>
+              <w:left w:val="single" w:sz="4" w:space="0" w:color="AAAAAA"/>
+              <w:right w:val="single" w:sz="4" w:space="0" w:color="AAAAAA"/>
+            </w:tcBorders>
+          </w:tcPr>
+          <w:p>
+            <w:r>
+              <w:rPr>
+                <w:sz w:val="16"/>
+              </w:rPr>
+              <w:t>1</w:t>
+            </w:r>
+          </w:p>
+        </w:tc>
+        <w:tc>
+          <w:tcPr>
+            <w:tcW w:type="dxa" w:w="1170"/>
+            <w:shd w:val="clear" w:color="auto" w:fill="DCE6F1"/>
+            <w:tcBorders>
+              <w:top w:val="single" w:sz="4" w:space="0" w:color="AAAAAA"/>
+              <w:bottom w:val="single" w:sz="4" w:space="0" w:color="AAAAAA"/>
+              <w:left w:val="single" w:sz="4" w:space="0" w:color="AAAAAA"/>
+              <w:right w:val="single" w:sz="4" w:space="0" w:color="AAAAAA"/>
+            </w:tcBorders>
+          </w:tcPr>
+          <w:p>
+            <w:r>
+              <w:rPr>
+                <w:sz w:val="16"/>
+              </w:rPr>
+              <w:t>$2.00</w:t>
+            </w:r>
+          </w:p>
+        </w:tc>
+        <w:tc>
+          <w:tcPr>
+            <w:tcW w:type="dxa" w:w="1170"/>
+            <w:shd w:val="clear" w:color="auto" w:fill="DCE6F1"/>
+            <w:tcBorders>
+              <w:top w:val="single" w:sz="4" w:space="0" w:color="AAAAAA"/>
+              <w:bottom w:val="single" w:sz="4" w:space="0" w:color="AAAAAA"/>
+              <w:left w:val="single" w:sz="4" w:space="0" w:color="AAAAAA"/>
+              <w:right w:val="single" w:sz="4" w:space="0" w:color="AAAAAA"/>
+            </w:tcBorders>
+          </w:tcPr>
+          <w:p>
+            <w:r>
+              <w:rPr>
+                <w:sz w:val="16"/>
+              </w:rPr>
+              <w:t>$0.80</w:t>
+            </w:r>
+          </w:p>
+        </w:tc>
+        <w:tc>
+          <w:tcPr>
+            <w:tcW w:type="dxa" w:w="1170"/>
+            <w:shd w:val="clear" w:color="auto" w:fill="DCE6F1"/>
+            <w:tcBorders>
+              <w:top w:val="single" w:sz="4" w:space="0" w:color="AAAAAA"/>
+              <w:bottom w:val="single" w:sz="4" w:space="0" w:color="AAAAAA"/>
+              <w:left w:val="single" w:sz="4" w:space="0" w:color="AAAAAA"/>
+              <w:right w:val="single" w:sz="4" w:space="0" w:color="AAAAAA"/>
+            </w:tcBorders>
+          </w:tcPr>
+          <w:p>
+            <w:r>
+              <w:rPr>
+                <w:sz w:val="16"/>
+              </w:rPr>
+              <w:t>$0.45</w:t>
+            </w:r>
+          </w:p>
+        </w:tc>
+        <w:tc>
+          <w:tcPr>
+            <w:tcW w:type="dxa" w:w="1170"/>
+            <w:shd w:val="clear" w:color="auto" w:fill="DCE6F1"/>
+            <w:tcBorders>
+              <w:top w:val="single" w:sz="4" w:space="0" w:color="AAAAAA"/>
+              <w:bottom w:val="single" w:sz="4" w:space="0" w:color="AAAAAA"/>
+              <w:left w:val="single" w:sz="4" w:space="0" w:color="AAAAAA"/>
+              <w:right w:val="single" w:sz="4" w:space="0" w:color="AAAAAA"/>
+            </w:tcBorders>
+          </w:tcPr>
+          <w:p>
+            <w:r>
+              <w:rPr>
+                <w:sz w:val="16"/>
+              </w:rPr>
+              <w:t>2-layer, HASL or ENIG finish</w:t>
+            </w:r>
+          </w:p>
+        </w:tc>
+      </w:tr>
+      <w:tr>
+        <w:tc>
+          <w:tcPr>
+            <w:tcW w:type="dxa" w:w="1170"/>
+            <w:shd w:val="clear" w:color="auto" w:fill="FFFFFF"/>
+            <w:tcBorders>
+              <w:top w:val="single" w:sz="4" w:space="0" w:color="AAAAAA"/>
+              <w:bottom w:val="single" w:sz="4" w:space="0" w:color="AAAAAA"/>
+              <w:left w:val="single" w:sz="4" w:space="0" w:color="AAAAAA"/>
+              <w:right w:val="single" w:sz="4" w:space="0" w:color="AAAAAA"/>
+            </w:tcBorders>
+          </w:tcPr>
+          <w:p>
+            <w:r>
+              <w:rPr>
+                <w:b/>
+                <w:sz w:val="16"/>
+              </w:rPr>
+              <w:t>--</w:t>
+            </w:r>
+          </w:p>
+        </w:tc>
+        <w:tc>
+          <w:tcPr>
+            <w:tcW w:type="dxa" w:w="1170"/>
+            <w:shd w:val="clear" w:color="auto" w:fill="FFFFFF"/>
+            <w:tcBorders>
+              <w:top w:val="single" w:sz="4" w:space="0" w:color="AAAAAA"/>
+              <w:bottom w:val="single" w:sz="4" w:space="0" w:color="AAAAAA"/>
+              <w:left w:val="single" w:sz="4" w:space="0" w:color="AAAAAA"/>
+              <w:right w:val="single" w:sz="4" w:space="0" w:color="AAAAAA"/>
+            </w:tcBorders>
+          </w:tcPr>
+          <w:p>
+            <w:r>
+              <w:rPr>
+                <w:sz w:val="16"/>
+              </w:rPr>
+              <w:t>SMT Assembly</w:t>
+            </w:r>
+          </w:p>
+        </w:tc>
+        <w:tc>
+          <w:tcPr>
+            <w:tcW w:type="dxa" w:w="1170"/>
+            <w:shd w:val="clear" w:color="auto" w:fill="FFFFFF"/>
+            <w:tcBorders>
+              <w:top w:val="single" w:sz="4" w:space="0" w:color="AAAAAA"/>
+              <w:bottom w:val="single" w:sz="4" w:space="0" w:color="AAAAAA"/>
+              <w:left w:val="single" w:sz="4" w:space="0" w:color="AAAAAA"/>
+              <w:right w:val="single" w:sz="4" w:space="0" w:color="AAAAAA"/>
+            </w:tcBorders>
+          </w:tcPr>
+          <w:p>
+            <w:r>
+              <w:rPr>
+                <w:sz w:val="16"/>
+              </w:rPr>
+              <w:t>JLCPCB</w:t>
+            </w:r>
+          </w:p>
+        </w:tc>
+        <w:tc>
+          <w:tcPr>
+            <w:tcW w:type="dxa" w:w="1170"/>
+            <w:shd w:val="clear" w:color="auto" w:fill="FFFFFF"/>
+            <w:tcBorders>
+              <w:top w:val="single" w:sz="4" w:space="0" w:color="AAAAAA"/>
+              <w:bottom w:val="single" w:sz="4" w:space="0" w:color="AAAAAA"/>
+              <w:left w:val="single" w:sz="4" w:space="0" w:color="AAAAAA"/>
+              <w:right w:val="single" w:sz="4" w:space="0" w:color="AAAAAA"/>
+            </w:tcBorders>
+          </w:tcPr>
+          <w:p>
+            <w:r>
+              <w:rPr>
+                <w:sz w:val="16"/>
+              </w:rPr>
+              <w:t>1</w:t>
+            </w:r>
+          </w:p>
+        </w:tc>
+        <w:tc>
+          <w:tcPr>
+            <w:tcW w:type="dxa" w:w="1170"/>
+            <w:shd w:val="clear" w:color="auto" w:fill="FFFFFF"/>
+            <w:tcBorders>
+              <w:top w:val="single" w:sz="4" w:space="0" w:color="AAAAAA"/>
+              <w:bottom w:val="single" w:sz="4" w:space="0" w:color="AAAAAA"/>
+              <w:left w:val="single" w:sz="4" w:space="0" w:color="AAAAAA"/>
+              <w:right w:val="single" w:sz="4" w:space="0" w:color="AAAAAA"/>
+            </w:tcBorders>
+          </w:tcPr>
+          <w:p>
+            <w:r>
+              <w:rPr>
+                <w:sz w:val="16"/>
+              </w:rPr>
+              <w:t>$8.00</w:t>
+            </w:r>
+          </w:p>
+        </w:tc>
+        <w:tc>
+          <w:tcPr>
+            <w:tcW w:type="dxa" w:w="1170"/>
+            <w:shd w:val="clear" w:color="auto" w:fill="FFFFFF"/>
+            <w:tcBorders>
+              <w:top w:val="single" w:sz="4" w:space="0" w:color="AAAAAA"/>
+              <w:bottom w:val="single" w:sz="4" w:space="0" w:color="AAAAAA"/>
+              <w:left w:val="single" w:sz="4" w:space="0" w:color="AAAAAA"/>
+              <w:right w:val="single" w:sz="4" w:space="0" w:color="AAAAAA"/>
+            </w:tcBorders>
+          </w:tcPr>
+          <w:p>
+            <w:r>
+              <w:rPr>
+                <w:sz w:val="16"/>
+              </w:rPr>
+              <w:t>$3.50</w:t>
+            </w:r>
+          </w:p>
+        </w:tc>
+        <w:tc>
+          <w:tcPr>
+            <w:tcW w:type="dxa" w:w="1170"/>
+            <w:shd w:val="clear" w:color="auto" w:fill="FFFFFF"/>
+            <w:tcBorders>
+              <w:top w:val="single" w:sz="4" w:space="0" w:color="AAAAAA"/>
+              <w:bottom w:val="single" w:sz="4" w:space="0" w:color="AAAAAA"/>
+              <w:left w:val="single" w:sz="4" w:space="0" w:color="AAAAAA"/>
+              <w:right w:val="single" w:sz="4" w:space="0" w:color="AAAAAA"/>
+            </w:tcBorders>
+          </w:tcPr>
+          <w:p>
+            <w:r>
+              <w:rPr>
+                <w:sz w:val="16"/>
+              </w:rPr>
+              <w:t>$2.00</w:t>
+            </w:r>
+          </w:p>
+        </w:tc>
+        <w:tc>
+          <w:tcPr>
+            <w:tcW w:type="dxa" w:w="1170"/>
+            <w:shd w:val="clear" w:color="auto" w:fill="FFFFFF"/>
+            <w:tcBorders>
+              <w:top w:val="single" w:sz="4" w:space="0" w:color="AAAAAA"/>
+              <w:bottom w:val="single" w:sz="4" w:space="0" w:color="AAAAAA"/>
+              <w:left w:val="single" w:sz="4" w:space="0" w:color="AAAAAA"/>
+              <w:right w:val="single" w:sz="4" w:space="0" w:color="AAAAAA"/>
+            </w:tcBorders>
+          </w:tcPr>
+          <w:p>
+            <w:r>
+              <w:rPr>
+                <w:sz w:val="16"/>
+              </w:rPr>
+              <w:t>JLCPCB Economic SMT</w:t>
+            </w:r>
+          </w:p>
+        </w:tc>
+      </w:tr>
+      <w:tr>
         <w:tc>
           <w:tcPr>
             <w:tcW w:type="dxa" w:w="1170"/>
@@ -6110,7 +6741,7 @@
                 <w:b/>
                 <w:sz w:val="16"/>
               </w:rPr>
-              <w:t>All components + PCB + assembly</w:t>
+              <w:t>TOTAL</w:t>
             </w:r>
           </w:p>
         </w:tc>
@@ -6131,6 +6762,7 @@
                 <w:b/>
                 <w:sz w:val="16"/>
               </w:rPr>
+              <w:t>All components + PCB + assembly</w:t>
             </w:r>
           </w:p>
         </w:tc>
@@ -6171,7 +6803,6 @@
                 <w:b/>
                 <w:sz w:val="16"/>
               </w:rPr>
-              <w:t>~$19.20</w:t>
             </w:r>
           </w:p>
         </w:tc>
@@ -6192,7 +6823,7 @@
                 <w:b/>
                 <w:sz w:val="16"/>
               </w:rPr>
-              <w:t>~$10.50</w:t>
+              <w:t>~$19.90</w:t>
             </w:r>
           </w:p>
         </w:tc>
@@ -6213,7 +6844,28 @@
                 <w:b/>
                 <w:sz w:val="16"/>
               </w:rPr>
-              <w:t>~$7.85</w:t>
+              <w:t>~$11.00</w:t>
+            </w:r>
+          </w:p>
+        </w:tc>
+        <w:tc>
+          <w:tcPr>
+            <w:tcW w:type="dxa" w:w="1170"/>
+            <w:shd w:val="clear" w:color="auto" w:fill="FFF2CC"/>
+            <w:tcBorders>
+              <w:top w:val="single" w:sz="4" w:space="0" w:color="AAAAAA"/>
+              <w:bottom w:val="single" w:sz="4" w:space="0" w:color="AAAAAA"/>
+              <w:left w:val="single" w:sz="4" w:space="0" w:color="AAAAAA"/>
+              <w:right w:val="single" w:sz="4" w:space="0" w:color="AAAAAA"/>
+            </w:tcBorders>
+          </w:tcPr>
+          <w:p>
+            <w:r>
+              <w:rPr>
+                <w:b/>
+                <w:sz w:val="16"/>
+              </w:rPr>
+              <w:t>~$8.10</w:t>
             </w:r>
           </w:p>
         </w:tc>
@@ -6270,7 +6922,7 @@
         <w:pStyle w:val="ListBullet"/>
       </w:pPr>
       <w:r>
-        <w:t>D12 (SS14 Schottky) adds ~$0.02/board -- protects every USB host used during development and field programming.</w:t>
+        <w:t>D12 (SS14 Schottky) adds ~$0.02/board -- protects every USB host used during development.</w:t>
       </w:r>
     </w:p>
     <w:p>
@@ -6278,7 +6930,7 @@
         <w:pStyle w:val="ListBullet"/>
       </w:pPr>
       <w:r>
-        <w:t>LM2596S-5.0 + MB10F add ~$0.72/board vs. USB-only design but eliminate the need for a separate 5V supply at the installation site.</w:t>
+        <w:t>T1, T2 (MMBT3904) are the auto-reset transistors that allow IDE flashing without pressing buttons.</w:t>
       </w:r>
     </w:p>
     <w:p>
@@ -6286,7 +6938,23 @@
         <w:pStyle w:val="ListBullet"/>
       </w:pPr>
       <w:r>
-        <w:t>ESP32 module dominates BOM cost (~33%). No cheaper certified WiFi+BT option at this volume.</w:t>
+        <w:t>R17-R21 (10k) and R22-R23 (5.1k) are small passives -- cheap but essential for correct ESP32 boot behaviour and USB-C detection.</w:t>
+      </w:r>
+    </w:p>
+    <w:p>
+      <w:pPr>
+        <w:pStyle w:val="ListBullet"/>
+      </w:pPr>
+      <w:r>
+        <w:t>LM2596S-5.0 + MB10F add ~$0.72/board vs. USB-only design but eliminate a separate 5V supply at the installation site.</w:t>
+      </w:r>
+    </w:p>
+    <w:p>
+      <w:pPr>
+        <w:pStyle w:val="ListBullet"/>
+      </w:pPr>
+      <w:r>
+        <w:t>ESP32 module dominates BOM cost (~32%). No cheaper certified WiFi+BT option at this volume.</w:t>
       </w:r>
     </w:p>
     <w:p>
@@ -7005,7 +7673,7 @@
         <w:pStyle w:val="ListBullet"/>
       </w:pPr>
       <w:r>
-        <w:t>Follow ESP32-WROOM-32E reference design for RF decoupling (39nF on antenna, no copper under antenna)</w:t>
+        <w:t>Follow ESP32-WROOM-32E reference design for RF decoupling</w:t>
       </w:r>
     </w:p>
     <w:p/>
@@ -7038,7 +7706,7 @@
         <w:pStyle w:val="ListBullet"/>
       </w:pPr>
       <w:r>
-        <w:t>Fuse holder, terminal strip, and USB-C connector on PCB edges for field access</w:t>
+        <w:t>Fuse holder, terminal strip, and USB-C connector on PCB edges</w:t>
       </w:r>
     </w:p>
     <w:p>
@@ -7054,15 +7722,7 @@
         <w:pStyle w:val="ListBullet"/>
       </w:pPr>
       <w:r>
-        <w:t>Maintain &gt;=1.0mm creepage between AC_IN pads and low-voltage traces</w:t>
-      </w:r>
-    </w:p>
-    <w:p>
-      <w:pPr>
-        <w:pStyle w:val="ListBullet"/>
-      </w:pPr>
-      <w:r>
-        <w:t>Add board version, FCC ID silkscreen, and QR code to firmware repo</w:t>
+        <w:t>Maintain &gt;= 1.0mm creepage between AC_IN pads and low-voltage traces</w:t>
       </w:r>
     </w:p>
     <w:p/>
@@ -7088,14 +7748,6 @@
       </w:pPr>
       <w:r>
         <w:t>Check courtyard clearances around relay bodies, fuse holder, terminal strip</w:t>
-      </w:r>
-    </w:p>
-    <w:p>
-      <w:pPr>
-        <w:pStyle w:val="ListBullet"/>
-      </w:pPr>
-      <w:r>
-        <w:t>Verify creepage/clearance between AC pads and low-voltage area</w:t>
       </w:r>
     </w:p>
     <w:p/>
@@ -7129,14 +7781,6 @@
       </w:pPr>
       <w:r>
         <w:t>CPL: export XY coordinates + rotation from EasyEDA</w:t>
-      </w:r>
-    </w:p>
-    <w:p>
-      <w:pPr>
-        <w:pStyle w:val="ListBullet"/>
-      </w:pPr>
-      <w:r>
-        <w:t>Flag any "Extended" LCSC parts (extra $3/part type setup fee)</w:t>
       </w:r>
     </w:p>
     <w:p/>
@@ -7202,7 +7846,7 @@
         <w:pStyle w:val="ListBullet"/>
       </w:pPr>
       <w:r>
-        <w:t>Connect both simultaneously and verify USB host sees no unexpected voltage</w:t>
+        <w:t>Connect both simultaneously; verify USB host shows no unexpected voltage</w:t>
       </w:r>
     </w:p>
     <w:p>
@@ -7211,14 +7855,6 @@
       </w:pPr>
       <w:r>
         <w:t>Measure current: ~80mA idle WiFi, ~650mA all 8 relays energised</w:t>
-      </w:r>
-    </w:p>
-    <w:p>
-      <w:pPr>
-        <w:pStyle w:val="ListBullet"/>
-      </w:pPr>
-      <w:r>
-        <w:t>Verify LM2596S-5.0 output stable under full relay switching load</w:t>
       </w:r>
     </w:p>
     <w:p/>
@@ -7232,7 +7868,7 @@
     </w:p>
     <w:p>
       <w:r>
-        <w:t>The ESP32-WROOM-32E module carries its own FCC Grant (FCC ID: 2AC7Z-ESPWROOM32) and CE marking, significantly simplifying the compliance path for the final product.</w:t>
+        <w:t>The ESP32-WROOM-32E module carries its own FCC Grant (FCC ID: 2AC7Z-ESPWROOM32) and CE marking, significantly simplifying the compliance path.</w:t>
       </w:r>
     </w:p>
     <w:p>
@@ -7337,7 +7973,7 @@
               <w:rPr>
                 <w:sz w:val="18"/>
               </w:rPr>
-              <w:t>Unintentional radiator -- self-declaration via SDoC. No lab testing required if module conditions met.</w:t>
+              <w:t>Unintentional radiator -- self-declaration via SDoC. No lab testing if module conditions met.</w:t>
             </w:r>
           </w:p>
         </w:tc>
@@ -7380,7 +8016,7 @@
               <w:rPr>
                 <w:sz w:val="18"/>
               </w:rPr>
-              <w:t>Do not modify ESP32 RF hardware or antenna. Maintain PCB antenna clearance per module datasheet.</w:t>
+              <w:t>Do not modify ESP32 RF hardware or antenna. Maintain PCB antenna clearance per datasheet.</w:t>
             </w:r>
           </w:p>
         </w:tc>
@@ -7423,7 +8059,7 @@
               <w:rPr>
                 <w:sz w:val="18"/>
               </w:rPr>
-              <w:t>~$500-1,500 (document preparation). No lab fees. One-time cost.</w:t>
+              <w:t>~$500-1,500 (document preparation). No lab fees. One-time.</w:t>
             </w:r>
           </w:p>
         </w:tc>
@@ -7704,7 +8340,7 @@
               <w:rPr>
                 <w:sz w:val="18"/>
               </w:rPr>
-              <w:t>~$1,000-2,500 for DoC preparation and technical file. No mandatory lab testing with certified module.</w:t>
+              <w:t>~$1,000-2,500 for DoC preparation and technical file.</w:t>
             </w:r>
           </w:p>
         </w:tc>
@@ -7719,7 +8355,7 @@
         <w:t xml:space="preserve">Note: </w:t>
       </w:r>
       <w:r>
-        <w:t>The board accepts 24VAC as its primary supply (~33.9V DC peak after rectification -- below both the LVD 75VDC and SELV 60VDC thresholds). Relay contacts switch 24VAC to valve solenoids. Include appropriate safety notices in product documentation regarding 24VAC wiring.</w:t>
+        <w:t>The board accepts 24VAC (~33.9V DC peak after rectification -- below both the LVD 75VDC and SELV 60VDC thresholds). Include appropriate safety notices regarding 24VAC wiring.</w:t>
       </w:r>
     </w:p>
     <w:p>
@@ -8056,7 +8692,7 @@
               <w:rPr>
                 <w:sz w:val="18"/>
               </w:rPr>
-              <w:t>One-time. At 1,000 units = $2.30-$6.00/board</w:t>
+              <w:t>At 1,000 units = $2.30-$6.00/board</w:t>
             </w:r>
           </w:p>
         </w:tc>
@@ -8187,7 +8823,7 @@
               <w:rPr>
                 <w:sz w:val="18"/>
               </w:rPr>
-              <w:t>~$7,850</w:t>
+              <w:t>~$8,100</w:t>
             </w:r>
           </w:p>
         </w:tc>
@@ -8207,7 +8843,7 @@
               <w:rPr>
                 <w:sz w:val="18"/>
               </w:rPr>
-              <w:t>$7.85</w:t>
+              <w:t>$8.10</w:t>
             </w:r>
           </w:p>
         </w:tc>
@@ -8566,7 +9202,7 @@
                 <w:b/>
                 <w:sz w:val="18"/>
               </w:rPr>
-              <w:t>~$15,050</w:t>
+              <w:t>~$15,300</w:t>
             </w:r>
           </w:p>
         </w:tc>
@@ -8587,7 +9223,7 @@
                 <w:b/>
                 <w:sz w:val="18"/>
               </w:rPr>
-              <w:t>~$15.05/unit</w:t>
+              <w:t>~$15.30/unit</w:t>
             </w:r>
           </w:p>
         </w:tc>
@@ -8596,7 +9232,7 @@
     <w:p/>
     <w:p>
       <w:r>
-        <w:t>At a retail price of $49-69, the margin is healthy even at 1,000 units. Comparable commercial controllers (Rachio, RainBird WiFi) retail at $80-180 for 8 zones.</w:t>
+        <w:t>At a retail price of $49-69, the margin is healthy even at 1,000 units. Comparable controllers (Rachio, RainBird WiFi) retail at $80-180 for 8 zones.</w:t>
       </w:r>
     </w:p>
     <w:p>
@@ -8646,7 +9282,7 @@
         <w:t xml:space="preserve">Power test: </w:t>
       </w:r>
       <w:r>
-        <w:t>On first prototype: verify 5V rail under USB-only and 24VAC-only; connect both simultaneously and confirm USB host sees no unexpected voltage.</w:t>
+        <w:t>Verify 5V rail under USB-only, 24VAC-only, and both simultaneously.</w:t>
       </w:r>
     </w:p>
     <w:p>
@@ -8674,7 +9310,7 @@
         <w:t xml:space="preserve">Soak test: </w:t>
       </w:r>
       <w:r>
-        <w:t>Run 48-hour soak test with real 24VAC valves; verify LM2596S-5.0 stable under full relay switching load.</w:t>
+        <w:t>48-hour soak test with real 24VAC valves; verify LM2596S-5.0 stable under full relay switching load.</w:t>
       </w:r>
     </w:p>
     <w:p>
@@ -8688,7 +9324,7 @@
         <w:t xml:space="preserve">DFM: </w:t>
       </w:r>
       <w:r>
-        <w:t>Submit Gerbers to JLCPCB DFM tool; resolve all warnings before production order.</w:t>
+        <w:t>Submit Gerbers to JLCPCB DFM tool; resolve all warnings.</w:t>
       </w:r>
     </w:p>
     <w:p>
@@ -8702,7 +9338,7 @@
         <w:t xml:space="preserve">FCC SDoC: </w:t>
       </w:r>
       <w:r>
-        <w:t>Engage compliance consultant after prototype validation -- $500-1,500, 2-4 weeks.</w:t>
+        <w:t>Engage compliance consultant after prototype validation -- $500-1,500.</w:t>
       </w:r>
     </w:p>
     <w:p>
@@ -8716,7 +9352,7 @@
         <w:t xml:space="preserve">Scale: </w:t>
       </w:r>
       <w:r>
-        <w:t>At 5,000+ units, negotiate with Shenzhen contract manufacturer for 20-30% further cost reduction.</w:t>
+        <w:t>At 5,000+ units, negotiate with Shenzhen contract manufacturer for 20-30% cost reduction.</w:t>
       </w:r>
     </w:p>
     <w:sectPr>

</xml_diff>

<commit_message>
Correct LCSC part numbers; switch to SMD electrolytics; split J2 into 3P+8P
Verified-wrong C-numbers replaced:
  L1  100uH inductor       C408444  -> C2929505 (CYH127-100UH)
  C1  470uF 50V SMD elec   C176680  -> C90272   (RVT1H471M1213)
  C2  220uF SMD elec       C176672  -> C4747974 (RST220UF25V019, 25V)
  F1  5x20mm fuse holder   C2897491 -> C3131    (BLX-A XC-7)
  U5  LM2596S-5.0          C347553  -> C347421  (UMW)
  J2  11P 5.08mm terminal  C8463    -> J2A C2915640 (3P) + J2B C5143711 (8P)

C1 and C2 are now SMD aluminum electrolytics (was through-hole).
</commit_message>
<xml_diff>
--- a/SprinKlr8_Design_Spec.docx
+++ b/SprinKlr8_Design_Spec.docx
@@ -2869,7 +2869,7 @@
               <w:rPr>
                 <w:sz w:val="16"/>
               </w:rPr>
-              <w:t>C347553</w:t>
+              <w:t>C347421</w:t>
             </w:r>
           </w:p>
         </w:tc>
@@ -4010,7 +4010,7 @@
               <w:rPr>
                 <w:sz w:val="16"/>
               </w:rPr>
-              <w:t>C8463</w:t>
+              <w:t>C2915640/C5143711</w:t>
             </w:r>
           </w:p>
         </w:tc>
@@ -4173,7 +4173,7 @@
               <w:rPr>
                 <w:sz w:val="16"/>
               </w:rPr>
-              <w:t>C2897491</w:t>
+              <w:t>C3131</w:t>
             </w:r>
           </w:p>
         </w:tc>
@@ -4336,7 +4336,7 @@
               <w:rPr>
                 <w:sz w:val="16"/>
               </w:rPr>
-              <w:t>C408444</w:t>
+              <w:t>C2929505</w:t>
             </w:r>
           </w:p>
         </w:tc>
@@ -4479,7 +4479,7 @@
               <w:rPr>
                 <w:sz w:val="16"/>
               </w:rPr>
-              <w:t>470uF 50V Electrolytic Radial</w:t>
+              <w:t>470uF 50V SMD Aluminum Electrolytic 10x10.5mm Radial</w:t>
             </w:r>
           </w:p>
         </w:tc>
@@ -4499,7 +4499,7 @@
               <w:rPr>
                 <w:sz w:val="16"/>
               </w:rPr>
-              <w:t>C176680</w:t>
+              <w:t>C90272</w:t>
             </w:r>
           </w:p>
         </w:tc>
@@ -4642,7 +4642,7 @@
               <w:rPr>
                 <w:sz w:val="16"/>
               </w:rPr>
-              <w:t>220uF 10V Electrolytic SMD</w:t>
+              <w:t>220uF 25V SMD Aluminum Electrolytic 6.3x7.7mm SMD</w:t>
             </w:r>
           </w:p>
         </w:tc>
@@ -4662,7 +4662,7 @@
               <w:rPr>
                 <w:sz w:val="16"/>
               </w:rPr>
-              <w:t>C176672</w:t>
+              <w:t>C4747974</w:t>
             </w:r>
           </w:p>
         </w:tc>

</xml_diff>